<commit_message>
Add validation evidence for blazorwebworker template creation and build
</commit_message>
<xml_diff>
--- a/Evidence/Blazor Web Worker Template Validation Report.docx
+++ b/Evidence/Blazor Web Worker Template Validation Report.docx
@@ -18,16 +18,7 @@
           <w:sz w:val="30"/>
           <w:szCs w:val="30"/>
         </w:rPr>
-        <w:t>T</w:t>
-      </w:r>
-      <w:r>
-        <w:rPr>
-          <w:b/>
-          <w:bCs/>
-          <w:sz w:val="30"/>
-          <w:szCs w:val="30"/>
-        </w:rPr>
-        <w:t>est Report</w:t>
+        <w:t>Test Report</w:t>
       </w:r>
     </w:p>
     <w:p>
@@ -447,19 +438,23 @@
                 <w:rPr>
                   <w:rStyle w:val="Hyperlink"/>
                 </w:rPr>
-                <w:t>WebW</w:t>
-              </w:r>
-              <w:r>
-                <w:rPr>
-                  <w:rStyle w:val="Hyperlink"/>
-                </w:rPr>
-                <w:t>o</w:t>
-              </w:r>
-              <w:r>
-                <w:rPr>
-                  <w:rStyle w:val="Hyperlink"/>
-                </w:rPr>
-                <w:t>rkers</w:t>
+                <w:t>WebWorkers</w:t>
+              </w:r>
+              <w:proofErr w:type="spellEnd"/>
+            </w:hyperlink>
+            <w:r>
+              <w:br/>
+            </w:r>
+            <w:r>
+              <w:br/>
+            </w:r>
+            <w:hyperlink r:id="rId12" w:history="1">
+              <w:proofErr w:type="spellStart"/>
+              <w:r>
+                <w:rPr>
+                  <w:rStyle w:val="Hyperlink"/>
+                </w:rPr>
+                <w:t>FreshProjectBuildValidation</w:t>
               </w:r>
               <w:proofErr w:type="spellEnd"/>
             </w:hyperlink>
@@ -493,25 +488,13 @@
           </w:tcPr>
           <w:p/>
           <w:p>
-            <w:hyperlink r:id="rId12" w:history="1">
+            <w:hyperlink r:id="rId13" w:history="1">
               <w:proofErr w:type="spellStart"/>
               <w:r>
                 <w:rPr>
                   <w:rStyle w:val="Hyperlink"/>
                 </w:rPr>
-                <w:t>In</w:t>
-              </w:r>
-              <w:r>
-                <w:rPr>
-                  <w:rStyle w:val="Hyperlink"/>
-                </w:rPr>
-                <w:t>t</w:t>
-              </w:r>
-              <w:r>
-                <w:rPr>
-                  <w:rStyle w:val="Hyperlink"/>
-                </w:rPr>
-                <w:t>eractiveWebAssembly</w:t>
+                <w:t>InteractiveWebAssembly</w:t>
               </w:r>
               <w:proofErr w:type="spellEnd"/>
             </w:hyperlink>
@@ -541,13 +524,26 @@
             </w:tcBorders>
           </w:tcPr>
           <w:p>
-            <w:hyperlink r:id="rId13" w:history="1">
+            <w:hyperlink r:id="rId14" w:history="1">
               <w:proofErr w:type="spellStart"/>
               <w:r>
                 <w:rPr>
                   <w:rStyle w:val="Hyperlink"/>
                 </w:rPr>
                 <w:t>ProjectBuildValidation</w:t>
+              </w:r>
+              <w:proofErr w:type="spellEnd"/>
+            </w:hyperlink>
+          </w:p>
+          <w:p/>
+          <w:p>
+            <w:hyperlink r:id="rId15" w:history="1">
+              <w:proofErr w:type="spellStart"/>
+              <w:r>
+                <w:rPr>
+                  <w:rStyle w:val="Hyperlink"/>
+                </w:rPr>
+                <w:t>FreshProjectBuildValidation</w:t>
               </w:r>
               <w:proofErr w:type="spellEnd"/>
             </w:hyperlink>
@@ -587,7 +583,7 @@
             <w:tcW w:w="1843" w:type="dxa"/>
           </w:tcPr>
           <w:p>
-            <w:hyperlink r:id="rId14" w:history="1">
+            <w:hyperlink r:id="rId16" w:history="1">
               <w:r>
                 <w:rPr>
                   <w:rStyle w:val="Hyperlink"/>
@@ -623,7 +619,7 @@
             <w:tcW w:w="2430" w:type="dxa"/>
           </w:tcPr>
           <w:p>
-            <w:hyperlink r:id="rId15" w:history="1">
+            <w:hyperlink r:id="rId17" w:history="1">
               <w:proofErr w:type="spellStart"/>
               <w:r>
                 <w:rPr>
@@ -660,7 +656,7 @@
             <w:tcW w:w="1843" w:type="dxa"/>
           </w:tcPr>
           <w:p>
-            <w:hyperlink r:id="rId16" w:history="1">
+            <w:hyperlink r:id="rId18" w:history="1">
               <w:proofErr w:type="spellStart"/>
               <w:r>
                 <w:rPr>
@@ -688,7 +684,7 @@
             <w:tcW w:w="2430" w:type="dxa"/>
           </w:tcPr>
           <w:p>
-            <w:hyperlink r:id="rId17" w:history="1">
+            <w:hyperlink r:id="rId19" w:history="1">
               <w:proofErr w:type="spellStart"/>
               <w:r>
                 <w:rPr>
@@ -713,7 +709,6 @@
           </w:tcPr>
           <w:p>
             <w:r>
-              <w:lastRenderedPageBreak/>
               <w:t>3</w:t>
             </w:r>
           </w:p>
@@ -749,7 +744,7 @@
             <w:tcW w:w="1843" w:type="dxa"/>
           </w:tcPr>
           <w:p>
-            <w:hyperlink r:id="rId18" w:history="1">
+            <w:hyperlink r:id="rId20" w:history="1">
               <w:r>
                 <w:rPr>
                   <w:rStyle w:val="Hyperlink"/>
@@ -783,7 +778,7 @@
             <w:tcW w:w="2430" w:type="dxa"/>
           </w:tcPr>
           <w:p>
-            <w:hyperlink r:id="rId19" w:history="1">
+            <w:hyperlink r:id="rId21" w:history="1">
               <w:proofErr w:type="spellStart"/>
               <w:r>
                 <w:rPr>
@@ -819,7 +814,7 @@
             <w:tcW w:w="1843" w:type="dxa"/>
           </w:tcPr>
           <w:p>
-            <w:hyperlink r:id="rId20" w:history="1">
+            <w:hyperlink r:id="rId22" w:history="1">
               <w:proofErr w:type="spellStart"/>
               <w:r>
                 <w:rPr>
@@ -847,7 +842,7 @@
             <w:tcW w:w="2430" w:type="dxa"/>
           </w:tcPr>
           <w:p>
-            <w:hyperlink r:id="rId21" w:history="1">
+            <w:hyperlink r:id="rId23" w:history="1">
               <w:proofErr w:type="spellStart"/>
               <w:r>
                 <w:rPr>
@@ -893,7 +888,7 @@
             <w:tcW w:w="1843" w:type="dxa"/>
           </w:tcPr>
           <w:p>
-            <w:hyperlink r:id="rId22" w:history="1">
+            <w:hyperlink r:id="rId24" w:history="1">
               <w:r>
                 <w:rPr>
                   <w:rStyle w:val="Hyperlink"/>
@@ -927,7 +922,7 @@
             <w:tcW w:w="2430" w:type="dxa"/>
           </w:tcPr>
           <w:p>
-            <w:hyperlink r:id="rId23" w:history="1">
+            <w:hyperlink r:id="rId25" w:history="1">
               <w:proofErr w:type="spellStart"/>
               <w:r>
                 <w:rPr>
@@ -963,7 +958,7 @@
             <w:tcW w:w="1843" w:type="dxa"/>
           </w:tcPr>
           <w:p>
-            <w:hyperlink r:id="rId24" w:history="1">
+            <w:hyperlink r:id="rId26" w:history="1">
               <w:proofErr w:type="spellStart"/>
               <w:r>
                 <w:rPr>
@@ -991,7 +986,7 @@
             <w:tcW w:w="2430" w:type="dxa"/>
           </w:tcPr>
           <w:p>
-            <w:hyperlink r:id="rId25" w:history="1">
+            <w:hyperlink r:id="rId27" w:history="1">
               <w:proofErr w:type="spellStart"/>
               <w:r>
                 <w:rPr>
@@ -1026,10 +1021,9 @@
           </w:tcPr>
           <w:p>
             <w:r>
-              <w:t>Disposing the client, and navigating away mid-call, produce no unhandled error in the browser console.</w:t>
-            </w:r>
-          </w:p>
-          <w:p/>
+              <w:t>Navigating away while a worker call is running, then returning and interacting with the page, produces an unhandled browser console error.</w:t>
+            </w:r>
+          </w:p>
           <w:p/>
         </w:tc>
         <w:tc>
@@ -1037,7 +1031,7 @@
             <w:tcW w:w="1843" w:type="dxa"/>
           </w:tcPr>
           <w:p>
-            <w:hyperlink r:id="rId26" w:history="1">
+            <w:hyperlink r:id="rId28" w:history="1">
               <w:r>
                 <w:rPr>
                   <w:rStyle w:val="Hyperlink"/>
@@ -1071,7 +1065,7 @@
             <w:tcW w:w="2430" w:type="dxa"/>
           </w:tcPr>
           <w:p>
-            <w:hyperlink r:id="rId27" w:history="1">
+            <w:hyperlink r:id="rId29" w:history="1">
               <w:proofErr w:type="spellStart"/>
               <w:r>
                 <w:rPr>
@@ -1107,7 +1101,7 @@
             <w:tcW w:w="1843" w:type="dxa"/>
           </w:tcPr>
           <w:p>
-            <w:hyperlink r:id="rId28" w:history="1">
+            <w:hyperlink r:id="rId30" w:history="1">
               <w:proofErr w:type="spellStart"/>
               <w:r>
                 <w:rPr>
@@ -1135,7 +1129,7 @@
             <w:tcW w:w="2430" w:type="dxa"/>
           </w:tcPr>
           <w:p>
-            <w:hyperlink r:id="rId29" w:history="1">
+            <w:hyperlink r:id="rId31" w:history="1">
               <w:proofErr w:type="spellStart"/>
               <w:r>
                 <w:rPr>
@@ -1182,7 +1176,7 @@
             <w:tcW w:w="1843" w:type="dxa"/>
           </w:tcPr>
           <w:p>
-            <w:hyperlink r:id="rId30" w:history="1">
+            <w:hyperlink r:id="rId32" w:history="1">
               <w:r>
                 <w:rPr>
                   <w:rStyle w:val="Hyperlink"/>
@@ -1216,7 +1210,7 @@
             <w:tcW w:w="2430" w:type="dxa"/>
           </w:tcPr>
           <w:p>
-            <w:hyperlink r:id="rId31" w:history="1">
+            <w:hyperlink r:id="rId33" w:history="1">
               <w:proofErr w:type="spellStart"/>
               <w:r>
                 <w:rPr>
@@ -1252,7 +1246,7 @@
             <w:tcW w:w="1843" w:type="dxa"/>
           </w:tcPr>
           <w:p>
-            <w:hyperlink r:id="rId32" w:history="1">
+            <w:hyperlink r:id="rId34" w:history="1">
               <w:proofErr w:type="spellStart"/>
               <w:r>
                 <w:rPr>
@@ -1280,7 +1274,7 @@
             <w:tcW w:w="2430" w:type="dxa"/>
           </w:tcPr>
           <w:p>
-            <w:hyperlink r:id="rId33" w:history="1">
+            <w:hyperlink r:id="rId35" w:history="1">
               <w:proofErr w:type="spellStart"/>
               <w:r>
                 <w:rPr>
@@ -1315,11 +1309,11 @@
           </w:tcPr>
           <w:p>
             <w:r>
-              <w:t xml:space="preserve">Publishing the app and running the published output. This is the reported repro: the worker worked in development and failed once published, where framework files are </w:t>
+              <w:t xml:space="preserve">Publishing the app and running the published output. This is the </w:t>
             </w:r>
             <w:r>
               <w:lastRenderedPageBreak/>
-              <w:t xml:space="preserve">fingerprinted. Do this </w:t>
+              <w:t xml:space="preserve">reported repro: the worker worked in development and failed once published, where framework files are fingerprinted. Do this </w:t>
             </w:r>
             <w:proofErr w:type="gramStart"/>
             <w:r>
@@ -1336,7 +1330,7 @@
             <w:tcW w:w="1843" w:type="dxa"/>
           </w:tcPr>
           <w:p>
-            <w:hyperlink r:id="rId34" w:history="1">
+            <w:hyperlink r:id="rId36" w:history="1">
               <w:r>
                 <w:rPr>
                   <w:rStyle w:val="Hyperlink"/>
@@ -1370,7 +1364,7 @@
             <w:tcW w:w="2430" w:type="dxa"/>
           </w:tcPr>
           <w:p>
-            <w:hyperlink r:id="rId35" w:history="1">
+            <w:hyperlink r:id="rId37" w:history="1">
               <w:proofErr w:type="spellStart"/>
               <w:r>
                 <w:rPr>
@@ -1406,7 +1400,7 @@
             <w:tcW w:w="1843" w:type="dxa"/>
           </w:tcPr>
           <w:p>
-            <w:hyperlink r:id="rId36" w:history="1">
+            <w:hyperlink r:id="rId38" w:history="1">
               <w:proofErr w:type="spellStart"/>
               <w:r>
                 <w:rPr>
@@ -1434,7 +1428,7 @@
             <w:tcW w:w="2430" w:type="dxa"/>
           </w:tcPr>
           <w:p>
-            <w:hyperlink r:id="rId37" w:history="1">
+            <w:hyperlink r:id="rId39" w:history="1">
               <w:proofErr w:type="spellStart"/>
               <w:r>
                 <w:rPr>
@@ -1482,7 +1476,7 @@
             <w:tcW w:w="1843" w:type="dxa"/>
           </w:tcPr>
           <w:p>
-            <w:hyperlink r:id="rId38" w:history="1">
+            <w:hyperlink r:id="rId40" w:history="1">
               <w:r>
                 <w:rPr>
                   <w:rStyle w:val="Hyperlink"/>
@@ -1516,7 +1510,7 @@
             <w:tcW w:w="2430" w:type="dxa"/>
           </w:tcPr>
           <w:p>
-            <w:hyperlink r:id="rId39" w:history="1">
+            <w:hyperlink r:id="rId41" w:history="1">
               <w:proofErr w:type="spellStart"/>
               <w:r>
                 <w:rPr>
@@ -1552,7 +1546,7 @@
             <w:tcW w:w="1843" w:type="dxa"/>
           </w:tcPr>
           <w:p>
-            <w:hyperlink r:id="rId40" w:history="1">
+            <w:hyperlink r:id="rId42" w:history="1">
               <w:proofErr w:type="spellStart"/>
               <w:r>
                 <w:rPr>
@@ -1580,7 +1574,7 @@
             <w:tcW w:w="2430" w:type="dxa"/>
           </w:tcPr>
           <w:p>
-            <w:hyperlink r:id="rId41" w:history="1">
+            <w:hyperlink r:id="rId43" w:history="1">
               <w:proofErr w:type="spellStart"/>
               <w:r>
                 <w:rPr>
@@ -1615,19 +1609,25 @@
           </w:tcPr>
           <w:p>
             <w:r>
-              <w:t xml:space="preserve">Disposing the client while a call is still </w:t>
+              <w:t xml:space="preserve">Explicitly </w:t>
             </w:r>
             <w:proofErr w:type="gramStart"/>
             <w:r>
-              <w:t>running, and</w:t>
+              <w:t>disposing</w:t>
             </w:r>
             <w:proofErr w:type="gramEnd"/>
             <w:r>
-              <w:t xml:space="preserve"> navigating away mid-call.</w:t>
-            </w:r>
-          </w:p>
-          <w:p/>
-          <w:p/>
+              <w:t xml:space="preserve"> the worker client during an active call </w:t>
+            </w:r>
+            <w:proofErr w:type="gramStart"/>
+            <w:r>
+              <w:t>faults</w:t>
+            </w:r>
+            <w:proofErr w:type="gramEnd"/>
+            <w:r>
+              <w:t xml:space="preserve"> the pending call in a controlled manner without an unhandled console error.</w:t>
+            </w:r>
+          </w:p>
           <w:p/>
         </w:tc>
         <w:tc>
@@ -1635,7 +1635,7 @@
             <w:tcW w:w="1843" w:type="dxa"/>
           </w:tcPr>
           <w:p>
-            <w:hyperlink r:id="rId42" w:history="1">
+            <w:hyperlink r:id="rId44" w:history="1">
               <w:r>
                 <w:rPr>
                   <w:rStyle w:val="Hyperlink"/>
@@ -1669,7 +1669,7 @@
             <w:tcW w:w="2430" w:type="dxa"/>
           </w:tcPr>
           <w:p>
-            <w:hyperlink r:id="rId43" w:history="1">
+            <w:hyperlink r:id="rId45" w:history="1">
               <w:proofErr w:type="spellStart"/>
               <w:r>
                 <w:rPr>
@@ -1705,7 +1705,7 @@
             <w:tcW w:w="1843" w:type="dxa"/>
           </w:tcPr>
           <w:p>
-            <w:hyperlink r:id="rId44" w:history="1">
+            <w:hyperlink r:id="rId46" w:history="1">
               <w:proofErr w:type="spellStart"/>
               <w:r>
                 <w:rPr>
@@ -1733,7 +1733,7 @@
             <w:tcW w:w="2430" w:type="dxa"/>
           </w:tcPr>
           <w:p>
-            <w:hyperlink r:id="rId45" w:history="1">
+            <w:hyperlink r:id="rId47" w:history="1">
               <w:proofErr w:type="spellStart"/>
               <w:r>
                 <w:rPr>
@@ -1781,7 +1781,7 @@
             <w:tcW w:w="1843" w:type="dxa"/>
           </w:tcPr>
           <w:p>
-            <w:hyperlink r:id="rId46" w:history="1">
+            <w:hyperlink r:id="rId48" w:history="1">
               <w:r>
                 <w:rPr>
                   <w:rStyle w:val="Hyperlink"/>
@@ -1815,7 +1815,7 @@
             <w:tcW w:w="2430" w:type="dxa"/>
           </w:tcPr>
           <w:p>
-            <w:hyperlink r:id="rId47" w:history="1">
+            <w:hyperlink r:id="rId49" w:history="1">
               <w:proofErr w:type="spellStart"/>
               <w:r>
                 <w:rPr>
@@ -1851,7 +1851,7 @@
             <w:tcW w:w="1843" w:type="dxa"/>
           </w:tcPr>
           <w:p>
-            <w:hyperlink r:id="rId48" w:history="1">
+            <w:hyperlink r:id="rId50" w:history="1">
               <w:proofErr w:type="spellStart"/>
               <w:r>
                 <w:rPr>
@@ -1879,7 +1879,7 @@
             <w:tcW w:w="2430" w:type="dxa"/>
           </w:tcPr>
           <w:p>
-            <w:hyperlink r:id="rId49" w:history="1">
+            <w:hyperlink r:id="rId51" w:history="1">
               <w:proofErr w:type="spellStart"/>
               <w:r>
                 <w:rPr>
@@ -1926,7 +1926,7 @@
             <w:tcW w:w="1843" w:type="dxa"/>
           </w:tcPr>
           <w:p>
-            <w:hyperlink r:id="rId50" w:history="1">
+            <w:hyperlink r:id="rId52" w:history="1">
               <w:r>
                 <w:rPr>
                   <w:rStyle w:val="Hyperlink"/>
@@ -1938,19 +1938,7 @@
                 <w:rPr>
                   <w:rStyle w:val="Hyperlink"/>
                 </w:rPr>
-                <w:t>WebAss</w:t>
-              </w:r>
-              <w:r>
-                <w:rPr>
-                  <w:rStyle w:val="Hyperlink"/>
-                </w:rPr>
-                <w:t>e</w:t>
-              </w:r>
-              <w:r>
-                <w:rPr>
-                  <w:rStyle w:val="Hyperlink"/>
-                </w:rPr>
-                <w:t>mbly</w:t>
+                <w:t>WebAssembly</w:t>
               </w:r>
               <w:proofErr w:type="spellEnd"/>
             </w:hyperlink>
@@ -1972,7 +1960,7 @@
           </w:tcPr>
           <w:p>
             <w:r>
-              <w:t>Fail</w:t>
+              <w:t>Pass</w:t>
             </w:r>
           </w:p>
         </w:tc>
@@ -1981,7 +1969,7 @@
             <w:tcW w:w="2430" w:type="dxa"/>
           </w:tcPr>
           <w:p>
-            <w:hyperlink r:id="rId51" w:history="1">
+            <w:hyperlink r:id="rId53" w:history="1">
               <w:proofErr w:type="spellStart"/>
               <w:r>
                 <w:rPr>
@@ -2018,7 +2006,7 @@
           </w:tcPr>
           <w:p/>
           <w:p>
-            <w:hyperlink r:id="rId52" w:history="1">
+            <w:hyperlink r:id="rId54" w:history="1">
               <w:proofErr w:type="spellStart"/>
               <w:r>
                 <w:rPr>
@@ -2046,6 +2034,7 @@
           </w:tcPr>
           <w:p>
             <w:r>
+              <w:lastRenderedPageBreak/>
               <w:t>Pass</w:t>
             </w:r>
           </w:p>
@@ -2055,7 +2044,7 @@
             <w:tcW w:w="2430" w:type="dxa"/>
           </w:tcPr>
           <w:p>
-            <w:hyperlink r:id="rId53" w:history="1">
+            <w:hyperlink r:id="rId55" w:history="1">
               <w:proofErr w:type="spellStart"/>
               <w:r>
                 <w:rPr>
@@ -2079,7 +2068,6 @@
           </w:tcPr>
           <w:p>
             <w:r>
-              <w:lastRenderedPageBreak/>
               <w:t>12</w:t>
             </w:r>
           </w:p>
@@ -2102,7 +2090,7 @@
             <w:tcW w:w="1843" w:type="dxa"/>
           </w:tcPr>
           <w:p>
-            <w:hyperlink r:id="rId54" w:history="1">
+            <w:hyperlink r:id="rId56" w:history="1">
               <w:r>
                 <w:rPr>
                   <w:rStyle w:val="Hyperlink"/>
@@ -2143,7 +2131,7 @@
             <w:tcW w:w="2430" w:type="dxa"/>
           </w:tcPr>
           <w:p>
-            <w:hyperlink r:id="rId55" w:history="1">
+            <w:hyperlink r:id="rId57" w:history="1">
               <w:proofErr w:type="spellStart"/>
               <w:r>
                 <w:rPr>
@@ -2181,7 +2169,7 @@
           </w:tcPr>
           <w:p/>
           <w:p>
-            <w:hyperlink r:id="rId56" w:history="1">
+            <w:hyperlink r:id="rId58" w:history="1">
               <w:proofErr w:type="spellStart"/>
               <w:r>
                 <w:rPr>
@@ -2194,13 +2182,7 @@
                 <w:rPr>
                   <w:rStyle w:val="Hyperlink"/>
                 </w:rPr>
-                <w:t xml:space="preserve"> </w:t>
-              </w:r>
-              <w:r>
-                <w:rPr>
-                  <w:rStyle w:val="Hyperlink"/>
-                </w:rPr>
-                <w:t>created through Visual Studio IDE</w:t>
+                <w:t xml:space="preserve"> created through Visual Studio IDE</w:t>
               </w:r>
             </w:hyperlink>
           </w:p>
@@ -2223,7 +2205,7 @@
             <w:tcW w:w="2430" w:type="dxa"/>
           </w:tcPr>
           <w:p>
-            <w:hyperlink r:id="rId57" w:history="1">
+            <w:hyperlink r:id="rId59" w:history="1">
               <w:proofErr w:type="spellStart"/>
               <w:r>
                 <w:rPr>
@@ -2392,24 +2374,12 @@
       <w:pPr>
         <w:ind w:left="720"/>
       </w:pPr>
-      <w:hyperlink r:id="rId58" w:history="1">
+      <w:hyperlink r:id="rId60" w:history="1">
         <w:r>
           <w:rPr>
             <w:rStyle w:val="Hyperlink"/>
           </w:rPr>
-          <w:t>https://github.c</w:t>
-        </w:r>
-        <w:r>
-          <w:rPr>
-            <w:rStyle w:val="Hyperlink"/>
-          </w:rPr>
-          <w:t>o</w:t>
-        </w:r>
-        <w:r>
-          <w:rPr>
-            <w:rStyle w:val="Hyperlink"/>
-          </w:rPr>
-          <w:t>m/Vinoth2562000/BlazorWebWorkerValidation/tree/main/Standalone_WebAssembly_NET11</w:t>
+          <w:t>https://github.com/Vinoth2562000/BlazorWebWorkerValidation/tree/main/Standalone_WebAssembly_NET11</w:t>
         </w:r>
       </w:hyperlink>
     </w:p>
@@ -2421,6 +2391,7 @@
         </w:numPr>
       </w:pPr>
       <w:r>
+        <w:lastRenderedPageBreak/>
         <w:t xml:space="preserve">Open a terminal and navigate to the </w:t>
       </w:r>
       <w:proofErr w:type="spellStart"/>
@@ -2460,7 +2431,6 @@
           <w:b/>
           <w:bCs/>
         </w:rPr>
-        <w:lastRenderedPageBreak/>
         <w:t>dotnet tool install --global dotnet-serve</w:t>
       </w:r>
     </w:p>
@@ -2739,7 +2709,7 @@
       <w:r>
         <w:br/>
       </w:r>
-      <w:hyperlink r:id="rId59" w:history="1">
+      <w:hyperlink r:id="rId61" w:history="1">
         <w:r>
           <w:rPr>
             <w:rStyle w:val="Hyperlink"/>
@@ -2757,6 +2727,56 @@
           <w:b/>
           <w:bCs/>
         </w:rPr>
+        <w:lastRenderedPageBreak/>
+        <w:t>Screenshot:</w:t>
+      </w:r>
+      <w:r>
+        <w:br/>
+      </w:r>
+      <w:r>
+        <w:drawing>
+          <wp:inline distT="0" distB="0" distL="0" distR="0" wp14:anchorId="6822C894" wp14:editId="0F7886D9">
+            <wp:extent cx="5655733" cy="2876207"/>
+            <wp:effectExtent l="0" t="0" r="2540" b="635"/>
+            <wp:docPr id="2115709835" name="Picture 1"/>
+            <wp:cNvGraphicFramePr>
+              <a:graphicFrameLocks xmlns:a="http://schemas.openxmlformats.org/drawingml/2006/main" noChangeAspect="1"/>
+            </wp:cNvGraphicFramePr>
+            <a:graphic xmlns:a="http://schemas.openxmlformats.org/drawingml/2006/main">
+              <a:graphicData uri="http://schemas.openxmlformats.org/drawingml/2006/picture">
+                <pic:pic xmlns:pic="http://schemas.openxmlformats.org/drawingml/2006/picture">
+                  <pic:nvPicPr>
+                    <pic:cNvPr id="2115709835" name=""/>
+                    <pic:cNvPicPr/>
+                  </pic:nvPicPr>
+                  <pic:blipFill>
+                    <a:blip r:embed="rId62"/>
+                    <a:stretch>
+                      <a:fillRect/>
+                    </a:stretch>
+                  </pic:blipFill>
+                  <pic:spPr>
+                    <a:xfrm>
+                      <a:off x="0" y="0"/>
+                      <a:ext cx="5695731" cy="2896548"/>
+                    </a:xfrm>
+                    <a:prstGeom prst="rect">
+                      <a:avLst/>
+                    </a:prstGeom>
+                  </pic:spPr>
+                </pic:pic>
+              </a:graphicData>
+            </a:graphic>
+          </wp:inline>
+        </w:drawing>
+      </w:r>
+    </w:p>
+    <w:p>
+      <w:r>
+        <w:rPr>
+          <w:b/>
+          <w:bCs/>
+        </w:rPr>
         <w:t>Observed behavior:</w:t>
       </w:r>
       <w:r>
@@ -2772,46 +2792,29 @@
       </w:r>
     </w:p>
     <w:p/>
-    <w:p>
-      <w:pPr>
-        <w:rPr>
-          <w:b/>
-          <w:bCs/>
-        </w:rPr>
-      </w:pPr>
-      <w:r>
-        <w:rPr>
-          <w:b/>
-          <w:bCs/>
-        </w:rPr>
-        <w:t>2</w:t>
-      </w:r>
-      <w:r>
-        <w:rPr>
-          <w:b/>
-          <w:bCs/>
-        </w:rPr>
-        <w:t>. Publishing with Trimming or Ahead-of-Time Compilation Enabled</w:t>
-      </w:r>
-    </w:p>
-    <w:p>
-      <w:pPr>
-        <w:rPr>
-          <w:b/>
-          <w:bCs/>
-        </w:rPr>
-      </w:pPr>
-      <w:r>
-        <w:rPr>
-          <w:b/>
-          <w:bCs/>
-        </w:rPr>
-        <w:t>What happened</w:t>
-      </w:r>
-    </w:p>
-    <w:p>
-      <w:r>
-        <w:t xml:space="preserve">When the Blazor </w:t>
+    <w:p/>
+    <w:p>
+      <w:pPr>
+        <w:rPr>
+          <w:b/>
+          <w:bCs/>
+          <w:sz w:val="30"/>
+          <w:szCs w:val="30"/>
+        </w:rPr>
+      </w:pPr>
+      <w:r>
+        <w:rPr>
+          <w:b/>
+          <w:bCs/>
+          <w:sz w:val="30"/>
+          <w:szCs w:val="30"/>
+        </w:rPr>
+        <w:t>Observation</w:t>
+      </w:r>
+    </w:p>
+    <w:p>
+      <w:r>
+        <w:t xml:space="preserve">During validation, trimming and </w:t>
       </w:r>
       <w:proofErr w:type="spellStart"/>
       <w:r>
@@ -2819,73 +2822,12 @@
       </w:r>
       <w:proofErr w:type="spellEnd"/>
       <w:r>
-        <w:t xml:space="preserve"> standalone application is published with trimming and AOT-related settings enabled, the application throws runtime errors in the browser console. The application does not function as expected after publishing.</w:t>
-      </w:r>
-    </w:p>
-    <w:p>
-      <w:pPr>
-        <w:rPr>
-          <w:b/>
-          <w:bCs/>
-        </w:rPr>
-      </w:pPr>
-      <w:r>
-        <w:rPr>
-          <w:b/>
-          <w:bCs/>
-        </w:rPr>
-        <w:lastRenderedPageBreak/>
-        <w:t>Expected behavior</w:t>
-      </w:r>
-    </w:p>
-    <w:p>
-      <w:r>
-        <w:t>The application should run successfully when published with trimming or ahead-of-time (AOT) compilation enabled. No runtime exceptions or browser console errors should occur.</w:t>
-      </w:r>
-    </w:p>
-    <w:p>
-      <w:pPr>
-        <w:rPr>
-          <w:b/>
-          <w:bCs/>
-        </w:rPr>
-      </w:pPr>
-      <w:r>
-        <w:rPr>
-          <w:b/>
-          <w:bCs/>
-        </w:rPr>
-        <w:t>Repository</w:t>
-      </w:r>
-    </w:p>
-    <w:p>
-      <w:hyperlink r:id="rId60" w:history="1">
-        <w:r>
-          <w:rPr>
-            <w:rStyle w:val="Hyperlink"/>
-          </w:rPr>
-          <w:t>https://github.com/Vinoth2562000/BlazorWebWorkerValidation/tree/main/Standalone_WebAssembly_NET11/TrimmedBlazorWebWorkerStandalone</w:t>
-        </w:r>
-      </w:hyperlink>
-    </w:p>
-    <w:p>
-      <w:pPr>
-        <w:rPr>
-          <w:b/>
-          <w:bCs/>
-        </w:rPr>
-      </w:pPr>
-      <w:r>
-        <w:rPr>
-          <w:b/>
-          <w:bCs/>
-        </w:rPr>
-        <w:t>Project Configuration</w:t>
-      </w:r>
-    </w:p>
-    <w:p>
-      <w:r>
-        <w:t>The application was published with the following settings:</w:t>
+        <w:t xml:space="preserve"> AOT settings were configured and tested using the following settings:</w:t>
+      </w:r>
+    </w:p>
+    <w:p>
+      <w:r>
+        <w:t> </w:t>
       </w:r>
     </w:p>
     <w:p>
@@ -2908,7 +2850,7 @@
           <w:b/>
           <w:bCs/>
         </w:rPr>
-        <w:t>PropertyGroup</w:t>
+        <w:t>PublishTrimmed</w:t>
       </w:r>
       <w:proofErr w:type="spellEnd"/>
       <w:r>
@@ -2916,12 +2858,74 @@
           <w:b/>
           <w:bCs/>
         </w:rPr>
+        <w:t>&gt;true&lt;/</w:t>
+      </w:r>
+      <w:proofErr w:type="spellStart"/>
+      <w:r>
+        <w:rPr>
+          <w:b/>
+          <w:bCs/>
+        </w:rPr>
+        <w:t>PublishTrimmed</w:t>
+      </w:r>
+      <w:proofErr w:type="spellEnd"/>
+      <w:r>
+        <w:rPr>
+          <w:b/>
+          <w:bCs/>
+        </w:rPr>
+        <w:t>&gt; </w:t>
+      </w:r>
+    </w:p>
+    <w:p>
+      <w:pPr>
+        <w:rPr>
+          <w:b/>
+          <w:bCs/>
+        </w:rPr>
+      </w:pPr>
+      <w:r>
+        <w:rPr>
+          <w:b/>
+          <w:bCs/>
+        </w:rPr>
+        <w:t>&lt;</w:t>
+      </w:r>
+      <w:proofErr w:type="spellStart"/>
+      <w:r>
+        <w:rPr>
+          <w:b/>
+          <w:bCs/>
+        </w:rPr>
+        <w:t>TrimMode</w:t>
+      </w:r>
+      <w:proofErr w:type="spellEnd"/>
+      <w:r>
+        <w:rPr>
+          <w:b/>
+          <w:bCs/>
+        </w:rPr>
+        <w:t>&gt;full&lt;/</w:t>
+      </w:r>
+      <w:proofErr w:type="spellStart"/>
+      <w:r>
+        <w:rPr>
+          <w:b/>
+          <w:bCs/>
+        </w:rPr>
+        <w:t>TrimMode</w:t>
+      </w:r>
+      <w:proofErr w:type="spellEnd"/>
+      <w:r>
+        <w:rPr>
+          <w:b/>
+          <w:bCs/>
+        </w:rPr>
         <w:t>&gt;</w:t>
       </w:r>
     </w:p>
     <w:p>
       <w:pPr>
-        <w:ind w:left="720"/>
         <w:rPr>
           <w:b/>
           <w:bCs/>
@@ -2940,7 +2944,7 @@
           <w:b/>
           <w:bCs/>
         </w:rPr>
-        <w:t>PublishTrimmed</w:t>
+        <w:t>RunAOTCompilation</w:t>
       </w:r>
       <w:proofErr w:type="spellEnd"/>
       <w:r>
@@ -2956,7 +2960,7 @@
           <w:b/>
           <w:bCs/>
         </w:rPr>
-        <w:t>PublishTrimmed</w:t>
+        <w:t>RunAOTCompilation</w:t>
       </w:r>
       <w:proofErr w:type="spellEnd"/>
       <w:r>
@@ -2968,384 +2972,43 @@
       </w:r>
     </w:p>
     <w:p>
-      <w:pPr>
-        <w:ind w:left="720"/>
-        <w:rPr>
-          <w:b/>
-          <w:bCs/>
-        </w:rPr>
-      </w:pPr>
-      <w:r>
-        <w:rPr>
-          <w:b/>
-          <w:bCs/>
-        </w:rPr>
-        <w:t>&lt;</w:t>
+      <w:r>
+        <w:t> </w:t>
+      </w:r>
+    </w:p>
+    <w:p>
+      <w:r>
+        <w:t xml:space="preserve">The application was successfully built, published, and exercised using the documented validation scenarios. No functional issues specific to trimming or </w:t>
       </w:r>
       <w:proofErr w:type="spellStart"/>
       <w:r>
-        <w:rPr>
-          <w:b/>
-          <w:bCs/>
-        </w:rPr>
-        <w:t>TrimMode</w:t>
+        <w:t>WebAssembly</w:t>
       </w:r>
       <w:proofErr w:type="spellEnd"/>
       <w:r>
-        <w:rPr>
-          <w:b/>
-          <w:bCs/>
-        </w:rPr>
-        <w:t>&gt;full&lt;/</w:t>
+        <w:t xml:space="preserve"> AOT were observed during testing.</w:t>
+      </w:r>
+    </w:p>
+    <w:p>
+      <w:r>
+        <w:rPr>
+          <w:b/>
+          <w:bCs/>
+        </w:rPr>
+        <w:t>Result:</w:t>
+      </w:r>
+      <w:r>
+        <w:t xml:space="preserve"> The application operated as expected with the tested trimming and </w:t>
       </w:r>
       <w:proofErr w:type="spellStart"/>
       <w:r>
-        <w:rPr>
-          <w:b/>
-          <w:bCs/>
-        </w:rPr>
-        <w:t>TrimMode</w:t>
+        <w:t>WebAssembly</w:t>
       </w:r>
       <w:proofErr w:type="spellEnd"/>
       <w:r>
-        <w:rPr>
-          <w:b/>
-          <w:bCs/>
-        </w:rPr>
-        <w:t>&gt;</w:t>
-      </w:r>
-    </w:p>
-    <w:p>
-      <w:pPr>
-        <w:rPr>
-          <w:b/>
-          <w:bCs/>
-        </w:rPr>
-      </w:pPr>
-      <w:r>
-        <w:rPr>
-          <w:b/>
-          <w:bCs/>
-        </w:rPr>
-        <w:t>&lt;/</w:t>
-      </w:r>
-      <w:proofErr w:type="spellStart"/>
-      <w:r>
-        <w:rPr>
-          <w:b/>
-          <w:bCs/>
-        </w:rPr>
-        <w:t>PropertyGroup</w:t>
-      </w:r>
-      <w:proofErr w:type="spellEnd"/>
-      <w:r>
-        <w:rPr>
-          <w:b/>
-          <w:bCs/>
-        </w:rPr>
-        <w:t>&gt;</w:t>
-      </w:r>
-    </w:p>
-    <w:p>
-      <w:pPr>
-        <w:rPr>
-          <w:b/>
-          <w:bCs/>
-        </w:rPr>
-      </w:pPr>
-      <w:r>
-        <w:rPr>
-          <w:b/>
-          <w:bCs/>
-        </w:rPr>
-        <w:t>Replication Steps</w:t>
-      </w:r>
-    </w:p>
-    <w:p>
-      <w:pPr>
-        <w:numPr>
-          <w:ilvl w:val="0"/>
-          <w:numId w:val="4"/>
-        </w:numPr>
-      </w:pPr>
-      <w:r>
-        <w:t>Clone the repository:</w:t>
-      </w:r>
-    </w:p>
-    <w:p>
-      <w:pPr>
-        <w:ind w:left="720"/>
-      </w:pPr>
-      <w:hyperlink r:id="rId61" w:history="1">
-        <w:r>
-          <w:rPr>
-            <w:rStyle w:val="Hyperlink"/>
-          </w:rPr>
-          <w:t>https://github.com/Vinoth2562000/BlazorWebWorkerValidation/tree/main/Standalone</w:t>
-        </w:r>
-        <w:r>
-          <w:rPr>
-            <w:rStyle w:val="Hyperlink"/>
-          </w:rPr>
-          <w:t>_</w:t>
-        </w:r>
-        <w:r>
-          <w:rPr>
-            <w:rStyle w:val="Hyperlink"/>
-          </w:rPr>
-          <w:t>WebAssembly_NET11</w:t>
-        </w:r>
-      </w:hyperlink>
-    </w:p>
-    <w:p>
-      <w:pPr>
-        <w:numPr>
-          <w:ilvl w:val="0"/>
-          <w:numId w:val="4"/>
-        </w:numPr>
-      </w:pPr>
-      <w:r>
-        <w:t xml:space="preserve">Open a terminal and navigate to the </w:t>
-      </w:r>
-      <w:proofErr w:type="spellStart"/>
-      <w:r>
-        <w:rPr>
-          <w:b/>
-          <w:bCs/>
-        </w:rPr>
-        <w:t>TrimmedBlazorWebWorkerStandalone</w:t>
-      </w:r>
-      <w:proofErr w:type="spellEnd"/>
-      <w:r>
-        <w:t xml:space="preserve"> project.</w:t>
-      </w:r>
-    </w:p>
-    <w:p>
-      <w:pPr>
-        <w:numPr>
-          <w:ilvl w:val="0"/>
-          <w:numId w:val="4"/>
-        </w:numPr>
-      </w:pPr>
-      <w:r>
-        <w:t>Install the dotnet-serve tool (if it is not already installed):</w:t>
-      </w:r>
-    </w:p>
-    <w:p>
-      <w:pPr>
-        <w:ind w:firstLine="720"/>
-        <w:rPr>
-          <w:b/>
-          <w:bCs/>
-        </w:rPr>
-      </w:pPr>
-      <w:r>
-        <w:rPr>
-          <w:b/>
-          <w:bCs/>
-        </w:rPr>
-        <w:t>dotnet tool install --global dotnet-serve</w:t>
-      </w:r>
-    </w:p>
-    <w:p>
-      <w:pPr>
-        <w:numPr>
-          <w:ilvl w:val="0"/>
-          <w:numId w:val="4"/>
-        </w:numPr>
-      </w:pPr>
-      <w:r>
-        <w:t>Publish the application:</w:t>
-      </w:r>
-    </w:p>
-    <w:p>
-      <w:pPr>
-        <w:ind w:firstLine="720"/>
-        <w:rPr>
-          <w:b/>
-          <w:bCs/>
-        </w:rPr>
-      </w:pPr>
-      <w:r>
-        <w:rPr>
-          <w:b/>
-          <w:bCs/>
-        </w:rPr>
-        <w:t>dotnet publish -c Release</w:t>
-      </w:r>
-    </w:p>
-    <w:p>
-      <w:pPr>
-        <w:numPr>
-          <w:ilvl w:val="0"/>
-          <w:numId w:val="4"/>
-        </w:numPr>
-      </w:pPr>
-      <w:r>
-        <w:t xml:space="preserve">Navigate to the </w:t>
-      </w:r>
-      <w:proofErr w:type="gramStart"/>
-      <w:r>
-        <w:t>publish</w:t>
-      </w:r>
-      <w:proofErr w:type="gramEnd"/>
-      <w:r>
-        <w:t xml:space="preserve"> output folder:</w:t>
-      </w:r>
-    </w:p>
-    <w:p>
-      <w:pPr>
-        <w:ind w:firstLine="720"/>
-        <w:rPr>
-          <w:b/>
-          <w:bCs/>
-        </w:rPr>
-      </w:pPr>
-      <w:r>
-        <w:rPr>
-          <w:b/>
-          <w:bCs/>
-        </w:rPr>
-        <w:t>cd bin\Release\net11.0\publish\</w:t>
-      </w:r>
-      <w:proofErr w:type="spellStart"/>
-      <w:r>
-        <w:rPr>
-          <w:b/>
-          <w:bCs/>
-        </w:rPr>
-        <w:t>wwwroot</w:t>
-      </w:r>
-      <w:proofErr w:type="spellEnd"/>
-    </w:p>
-    <w:p>
-      <w:pPr>
-        <w:numPr>
-          <w:ilvl w:val="0"/>
-          <w:numId w:val="4"/>
-        </w:numPr>
-      </w:pPr>
-      <w:r>
-        <w:t>Start the application:</w:t>
-      </w:r>
-    </w:p>
-    <w:p>
-      <w:pPr>
-        <w:ind w:firstLine="720"/>
-        <w:rPr>
-          <w:b/>
-          <w:bCs/>
-        </w:rPr>
-      </w:pPr>
-      <w:r>
-        <w:rPr>
-          <w:b/>
-          <w:bCs/>
-        </w:rPr>
-        <w:t>dotnet-serve -S</w:t>
-      </w:r>
-    </w:p>
-    <w:p>
-      <w:pPr>
-        <w:numPr>
-          <w:ilvl w:val="0"/>
-          <w:numId w:val="4"/>
-        </w:numPr>
-      </w:pPr>
-      <w:r>
-        <w:t>Open the localhost URL displayed in the terminal.</w:t>
-      </w:r>
-    </w:p>
-    <w:p>
-      <w:pPr>
-        <w:numPr>
-          <w:ilvl w:val="0"/>
-          <w:numId w:val="4"/>
-        </w:numPr>
-      </w:pPr>
-      <w:r>
-        <w:lastRenderedPageBreak/>
-        <w:t xml:space="preserve">Open </w:t>
-      </w:r>
-      <w:r>
-        <w:rPr>
-          <w:b/>
-          <w:bCs/>
-        </w:rPr>
-        <w:t xml:space="preserve">Browser </w:t>
-      </w:r>
-      <w:proofErr w:type="spellStart"/>
-      <w:r>
-        <w:rPr>
-          <w:b/>
-          <w:bCs/>
-        </w:rPr>
-        <w:t>DevTools</w:t>
-      </w:r>
-      <w:proofErr w:type="spellEnd"/>
-      <w:r>
-        <w:rPr>
-          <w:b/>
-          <w:bCs/>
-        </w:rPr>
-        <w:t xml:space="preserve"> → Console</w:t>
-      </w:r>
-      <w:r>
-        <w:t>.</w:t>
-      </w:r>
-    </w:p>
-    <w:p>
-      <w:pPr>
-        <w:numPr>
-          <w:ilvl w:val="0"/>
-          <w:numId w:val="4"/>
-        </w:numPr>
-      </w:pPr>
-      <w:r>
-        <w:t>Observe the runtime error displayed in the browser console.</w:t>
-      </w:r>
-    </w:p>
-    <w:p>
-      <w:r>
-        <w:rPr>
-          <w:b/>
-          <w:bCs/>
-        </w:rPr>
-        <w:t>Evidence</w:t>
-      </w:r>
-      <w:r>
-        <w:t xml:space="preserve">: </w:t>
-      </w:r>
-      <w:hyperlink r:id="rId62" w:history="1">
-        <w:r>
-          <w:rPr>
-            <w:rStyle w:val="Hyperlink"/>
-          </w:rPr>
-          <w:t>Evidence 05</w:t>
-        </w:r>
-      </w:hyperlink>
-    </w:p>
-    <w:p>
-      <w:pPr>
-        <w:rPr>
-          <w:b/>
-          <w:bCs/>
-        </w:rPr>
-      </w:pPr>
-      <w:r>
-        <w:rPr>
-          <w:b/>
-          <w:bCs/>
-        </w:rPr>
-        <w:t>Observed Behavior</w:t>
-      </w:r>
-    </w:p>
-    <w:p>
-      <w:r>
-        <w:t>After publishing with trimming and AOT enabled, the application displays runtime errors in the browser console.</w:t>
-      </w:r>
-    </w:p>
-    <w:p/>
+        <w:t xml:space="preserve"> AOT configuration during the validation activities conducted.</w:t>
+      </w:r>
+    </w:p>
     <w:p/>
     <w:p>
       <w:pPr>

</xml_diff>

<commit_message>
Add validation evidence for blazorwebworker template creation
</commit_message>
<xml_diff>
--- a/Evidence/Blazor Web Worker Template Validation Report.docx
+++ b/Evidence/Blazor Web Worker Template Validation Report.docx
@@ -350,15 +350,7 @@
             </w:r>
             <w:proofErr w:type="spellEnd"/>
             <w:r>
-              <w:t xml:space="preserve">. The template is also available in the IDE, and a newly created project </w:t>
-            </w:r>
-            <w:proofErr w:type="gramStart"/>
-            <w:r>
-              <w:t>builds</w:t>
-            </w:r>
-            <w:proofErr w:type="gramEnd"/>
-            <w:r>
-              <w:t xml:space="preserve"> successfully without source changes.</w:t>
+              <w:t>. The template is also available in the IDE, and a newly created project builds successfully without source changes.</w:t>
             </w:r>
           </w:p>
         </w:tc>
@@ -1144,7 +1136,7 @@
       </w:tr>
       <w:tr>
         <w:trPr>
-          <w:trHeight w:val="939"/>
+          <w:trHeight w:val="1114"/>
         </w:trPr>
         <w:tc>
           <w:tcPr>
@@ -1164,12 +1156,9 @@
           </w:tcPr>
           <w:p>
             <w:r>
-              <w:t>The published app loads its worker successfully, with no failed request for framework files in the network log, and no Worker encountered an error message in the browser console.</w:t>
-            </w:r>
-          </w:p>
-          <w:p/>
-          <w:p/>
-          <w:p/>
+              <w:t>Publishing the app and running the published output. This is the reported repro: the worker worked in development and failed once published, where framework files are fingerprinted. Do this early rather than last.</w:t>
+            </w:r>
+          </w:p>
         </w:tc>
         <w:tc>
           <w:tcPr>
@@ -1211,160 +1200,6 @@
           </w:tcPr>
           <w:p>
             <w:hyperlink r:id="rId33" w:history="1">
-              <w:proofErr w:type="spellStart"/>
-              <w:r>
-                <w:rPr>
-                  <w:rStyle w:val="Hyperlink"/>
-                </w:rPr>
-                <w:t>PublishedAppWorkerLoadValidation</w:t>
-              </w:r>
-              <w:proofErr w:type="spellEnd"/>
-            </w:hyperlink>
-          </w:p>
-        </w:tc>
-      </w:tr>
-      <w:tr>
-        <w:trPr>
-          <w:trHeight w:val="883"/>
-        </w:trPr>
-        <w:tc>
-          <w:tcPr>
-            <w:tcW w:w="774" w:type="dxa"/>
-            <w:vMerge/>
-          </w:tcPr>
-          <w:p/>
-        </w:tc>
-        <w:tc>
-          <w:tcPr>
-            <w:tcW w:w="2783" w:type="dxa"/>
-            <w:vMerge/>
-          </w:tcPr>
-          <w:p/>
-        </w:tc>
-        <w:tc>
-          <w:tcPr>
-            <w:tcW w:w="1843" w:type="dxa"/>
-          </w:tcPr>
-          <w:p>
-            <w:hyperlink r:id="rId34" w:history="1">
-              <w:proofErr w:type="spellStart"/>
-              <w:r>
-                <w:rPr>
-                  <w:rStyle w:val="Hyperlink"/>
-                </w:rPr>
-                <w:t>InteractiveWebAssembly</w:t>
-              </w:r>
-              <w:proofErr w:type="spellEnd"/>
-            </w:hyperlink>
-          </w:p>
-          <w:p/>
-        </w:tc>
-        <w:tc>
-          <w:tcPr>
-            <w:tcW w:w="1620" w:type="dxa"/>
-          </w:tcPr>
-          <w:p>
-            <w:r>
-              <w:t>Pass</w:t>
-            </w:r>
-          </w:p>
-        </w:tc>
-        <w:tc>
-          <w:tcPr>
-            <w:tcW w:w="2430" w:type="dxa"/>
-          </w:tcPr>
-          <w:p>
-            <w:hyperlink r:id="rId35" w:history="1">
-              <w:proofErr w:type="spellStart"/>
-              <w:r>
-                <w:rPr>
-                  <w:rStyle w:val="Hyperlink"/>
-                </w:rPr>
-                <w:t>PublishedAppWorkerLoadValidation</w:t>
-              </w:r>
-              <w:proofErr w:type="spellEnd"/>
-            </w:hyperlink>
-          </w:p>
-        </w:tc>
-      </w:tr>
-      <w:tr>
-        <w:trPr>
-          <w:trHeight w:val="1114"/>
-        </w:trPr>
-        <w:tc>
-          <w:tcPr>
-            <w:tcW w:w="774" w:type="dxa"/>
-            <w:vMerge w:val="restart"/>
-          </w:tcPr>
-          <w:p>
-            <w:r>
-              <w:t>7</w:t>
-            </w:r>
-          </w:p>
-        </w:tc>
-        <w:tc>
-          <w:tcPr>
-            <w:tcW w:w="2783" w:type="dxa"/>
-            <w:vMerge w:val="restart"/>
-          </w:tcPr>
-          <w:p>
-            <w:r>
-              <w:t xml:space="preserve">Publishing the app and running the published output. This is the </w:t>
-            </w:r>
-            <w:r>
-              <w:lastRenderedPageBreak/>
-              <w:t xml:space="preserve">reported repro: the worker worked in development and failed once published, where framework files are fingerprinted. Do this </w:t>
-            </w:r>
-            <w:proofErr w:type="gramStart"/>
-            <w:r>
-              <w:t>early</w:t>
-            </w:r>
-            <w:proofErr w:type="gramEnd"/>
-            <w:r>
-              <w:t xml:space="preserve"> rather than last.</w:t>
-            </w:r>
-          </w:p>
-        </w:tc>
-        <w:tc>
-          <w:tcPr>
-            <w:tcW w:w="1843" w:type="dxa"/>
-          </w:tcPr>
-          <w:p>
-            <w:hyperlink r:id="rId36" w:history="1">
-              <w:r>
-                <w:rPr>
-                  <w:rStyle w:val="Hyperlink"/>
-                </w:rPr>
-                <w:t xml:space="preserve">Standalone </w:t>
-              </w:r>
-              <w:proofErr w:type="spellStart"/>
-              <w:r>
-                <w:rPr>
-                  <w:rStyle w:val="Hyperlink"/>
-                </w:rPr>
-                <w:t>WebAssembly</w:t>
-              </w:r>
-              <w:proofErr w:type="spellEnd"/>
-            </w:hyperlink>
-          </w:p>
-          <w:p/>
-        </w:tc>
-        <w:tc>
-          <w:tcPr>
-            <w:tcW w:w="1620" w:type="dxa"/>
-          </w:tcPr>
-          <w:p>
-            <w:r>
-              <w:t>Pass</w:t>
-            </w:r>
-          </w:p>
-        </w:tc>
-        <w:tc>
-          <w:tcPr>
-            <w:tcW w:w="2430" w:type="dxa"/>
-          </w:tcPr>
-          <w:p>
-            <w:hyperlink r:id="rId37" w:history="1">
               <w:proofErr w:type="spellStart"/>
               <w:r>
                 <w:rPr>
@@ -1400,7 +1235,7 @@
             <w:tcW w:w="1843" w:type="dxa"/>
           </w:tcPr>
           <w:p>
-            <w:hyperlink r:id="rId38" w:history="1">
+            <w:hyperlink r:id="rId34" w:history="1">
               <w:proofErr w:type="spellStart"/>
               <w:r>
                 <w:rPr>
@@ -1428,7 +1263,7 @@
             <w:tcW w:w="2430" w:type="dxa"/>
           </w:tcPr>
           <w:p>
-            <w:hyperlink r:id="rId39" w:history="1">
+            <w:hyperlink r:id="rId35" w:history="1">
               <w:proofErr w:type="spellStart"/>
               <w:r>
                 <w:rPr>
@@ -1452,7 +1287,7 @@
           </w:tcPr>
           <w:p>
             <w:r>
-              <w:t>8</w:t>
+              <w:t>7</w:t>
             </w:r>
           </w:p>
         </w:tc>
@@ -1476,7 +1311,7 @@
             <w:tcW w:w="1843" w:type="dxa"/>
           </w:tcPr>
           <w:p>
-            <w:hyperlink r:id="rId40" w:history="1">
+            <w:hyperlink r:id="rId36" w:history="1">
               <w:r>
                 <w:rPr>
                   <w:rStyle w:val="Hyperlink"/>
@@ -1510,7 +1345,7 @@
             <w:tcW w:w="2430" w:type="dxa"/>
           </w:tcPr>
           <w:p>
-            <w:hyperlink r:id="rId41" w:history="1">
+            <w:hyperlink r:id="rId37" w:history="1">
               <w:proofErr w:type="spellStart"/>
               <w:r>
                 <w:rPr>
@@ -1546,7 +1381,7 @@
             <w:tcW w:w="1843" w:type="dxa"/>
           </w:tcPr>
           <w:p>
-            <w:hyperlink r:id="rId42" w:history="1">
+            <w:hyperlink r:id="rId38" w:history="1">
               <w:proofErr w:type="spellStart"/>
               <w:r>
                 <w:rPr>
@@ -1565,6 +1400,7 @@
           </w:tcPr>
           <w:p>
             <w:r>
+              <w:lastRenderedPageBreak/>
               <w:t>Pass</w:t>
             </w:r>
           </w:p>
@@ -1574,7 +1410,7 @@
             <w:tcW w:w="2430" w:type="dxa"/>
           </w:tcPr>
           <w:p>
-            <w:hyperlink r:id="rId43" w:history="1">
+            <w:hyperlink r:id="rId39" w:history="1">
               <w:proofErr w:type="spellStart"/>
               <w:r>
                 <w:rPr>
@@ -1598,7 +1434,7 @@
           </w:tcPr>
           <w:p>
             <w:r>
-              <w:t>9</w:t>
+              <w:t>8</w:t>
             </w:r>
           </w:p>
         </w:tc>
@@ -1609,23 +1445,7 @@
           </w:tcPr>
           <w:p>
             <w:r>
-              <w:t xml:space="preserve">Explicitly </w:t>
-            </w:r>
-            <w:proofErr w:type="gramStart"/>
-            <w:r>
-              <w:t>disposing</w:t>
-            </w:r>
-            <w:proofErr w:type="gramEnd"/>
-            <w:r>
-              <w:t xml:space="preserve"> the worker client during an active call </w:t>
-            </w:r>
-            <w:proofErr w:type="gramStart"/>
-            <w:r>
-              <w:t>faults</w:t>
-            </w:r>
-            <w:proofErr w:type="gramEnd"/>
-            <w:r>
-              <w:t xml:space="preserve"> the pending call in a controlled manner without an unhandled console error.</w:t>
+              <w:t>Explicitly disposing the worker client during an active call faults the pending call in a controlled manner without an unhandled console error.</w:t>
             </w:r>
           </w:p>
           <w:p/>
@@ -1635,7 +1455,7 @@
             <w:tcW w:w="1843" w:type="dxa"/>
           </w:tcPr>
           <w:p>
-            <w:hyperlink r:id="rId44" w:history="1">
+            <w:hyperlink r:id="rId40" w:history="1">
               <w:r>
                 <w:rPr>
                   <w:rStyle w:val="Hyperlink"/>
@@ -1669,7 +1489,7 @@
             <w:tcW w:w="2430" w:type="dxa"/>
           </w:tcPr>
           <w:p>
-            <w:hyperlink r:id="rId45" w:history="1">
+            <w:hyperlink r:id="rId41" w:history="1">
               <w:proofErr w:type="spellStart"/>
               <w:r>
                 <w:rPr>
@@ -1705,7 +1525,7 @@
             <w:tcW w:w="1843" w:type="dxa"/>
           </w:tcPr>
           <w:p>
-            <w:hyperlink r:id="rId46" w:history="1">
+            <w:hyperlink r:id="rId42" w:history="1">
               <w:proofErr w:type="spellStart"/>
               <w:r>
                 <w:rPr>
@@ -1733,7 +1553,7 @@
             <w:tcW w:w="2430" w:type="dxa"/>
           </w:tcPr>
           <w:p>
-            <w:hyperlink r:id="rId47" w:history="1">
+            <w:hyperlink r:id="rId43" w:history="1">
               <w:proofErr w:type="spellStart"/>
               <w:r>
                 <w:rPr>
@@ -1757,7 +1577,7 @@
           </w:tcPr>
           <w:p>
             <w:r>
-              <w:t>10</w:t>
+              <w:t>9</w:t>
             </w:r>
           </w:p>
         </w:tc>
@@ -1781,7 +1601,7 @@
             <w:tcW w:w="1843" w:type="dxa"/>
           </w:tcPr>
           <w:p>
-            <w:hyperlink r:id="rId48" w:history="1">
+            <w:hyperlink r:id="rId44" w:history="1">
               <w:r>
                 <w:rPr>
                   <w:rStyle w:val="Hyperlink"/>
@@ -1815,7 +1635,7 @@
             <w:tcW w:w="2430" w:type="dxa"/>
           </w:tcPr>
           <w:p>
-            <w:hyperlink r:id="rId49" w:history="1">
+            <w:hyperlink r:id="rId45" w:history="1">
               <w:proofErr w:type="spellStart"/>
               <w:r>
                 <w:rPr>
@@ -1851,7 +1671,7 @@
             <w:tcW w:w="1843" w:type="dxa"/>
           </w:tcPr>
           <w:p>
-            <w:hyperlink r:id="rId50" w:history="1">
+            <w:hyperlink r:id="rId46" w:history="1">
               <w:proofErr w:type="spellStart"/>
               <w:r>
                 <w:rPr>
@@ -1879,7 +1699,7 @@
             <w:tcW w:w="2430" w:type="dxa"/>
           </w:tcPr>
           <w:p>
-            <w:hyperlink r:id="rId51" w:history="1">
+            <w:hyperlink r:id="rId47" w:history="1">
               <w:proofErr w:type="spellStart"/>
               <w:r>
                 <w:rPr>
@@ -1903,7 +1723,10 @@
           </w:tcPr>
           <w:p>
             <w:r>
-              <w:t>11</w:t>
+              <w:t>1</w:t>
+            </w:r>
+            <w:r>
+              <w:t>0</w:t>
             </w:r>
           </w:p>
         </w:tc>
@@ -1926,7 +1749,7 @@
             <w:tcW w:w="1843" w:type="dxa"/>
           </w:tcPr>
           <w:p>
-            <w:hyperlink r:id="rId52" w:history="1">
+            <w:hyperlink r:id="rId48" w:history="1">
               <w:r>
                 <w:rPr>
                   <w:rStyle w:val="Hyperlink"/>
@@ -1969,7 +1792,7 @@
             <w:tcW w:w="2430" w:type="dxa"/>
           </w:tcPr>
           <w:p>
-            <w:hyperlink r:id="rId53" w:history="1">
+            <w:hyperlink r:id="rId49" w:history="1">
               <w:proofErr w:type="spellStart"/>
               <w:r>
                 <w:rPr>
@@ -2006,7 +1829,7 @@
           </w:tcPr>
           <w:p/>
           <w:p>
-            <w:hyperlink r:id="rId54" w:history="1">
+            <w:hyperlink r:id="rId50" w:history="1">
               <w:proofErr w:type="spellStart"/>
               <w:r>
                 <w:rPr>
@@ -2034,7 +1857,6 @@
           </w:tcPr>
           <w:p>
             <w:r>
-              <w:lastRenderedPageBreak/>
               <w:t>Pass</w:t>
             </w:r>
           </w:p>
@@ -2044,7 +1866,7 @@
             <w:tcW w:w="2430" w:type="dxa"/>
           </w:tcPr>
           <w:p>
-            <w:hyperlink r:id="rId55" w:history="1">
+            <w:hyperlink r:id="rId51" w:history="1">
               <w:proofErr w:type="spellStart"/>
               <w:r>
                 <w:rPr>
@@ -2068,7 +1890,10 @@
           </w:tcPr>
           <w:p>
             <w:r>
-              <w:t>12</w:t>
+              <w:t>1</w:t>
+            </w:r>
+            <w:r>
+              <w:t>1</w:t>
             </w:r>
           </w:p>
         </w:tc>
@@ -2090,7 +1915,7 @@
             <w:tcW w:w="1843" w:type="dxa"/>
           </w:tcPr>
           <w:p>
-            <w:hyperlink r:id="rId56" w:history="1">
+            <w:hyperlink r:id="rId52" w:history="1">
               <w:r>
                 <w:rPr>
                   <w:rStyle w:val="Hyperlink"/>
@@ -2131,7 +1956,7 @@
             <w:tcW w:w="2430" w:type="dxa"/>
           </w:tcPr>
           <w:p>
-            <w:hyperlink r:id="rId57" w:history="1">
+            <w:hyperlink r:id="rId53" w:history="1">
               <w:proofErr w:type="spellStart"/>
               <w:r>
                 <w:rPr>
@@ -2147,7 +1972,7 @@
       </w:tr>
       <w:tr>
         <w:trPr>
-          <w:trHeight w:val="1190"/>
+          <w:trHeight w:val="2600"/>
         </w:trPr>
         <w:tc>
           <w:tcPr>
@@ -2169,6 +1994,155 @@
           </w:tcPr>
           <w:p/>
           <w:p>
+            <w:hyperlink r:id="rId54" w:history="1">
+              <w:proofErr w:type="spellStart"/>
+              <w:r>
+                <w:rPr>
+                  <w:rStyle w:val="Hyperlink"/>
+                </w:rPr>
+                <w:t>InteractiveWebAssembly</w:t>
+              </w:r>
+              <w:proofErr w:type="spellEnd"/>
+              <w:r>
+                <w:rPr>
+                  <w:rStyle w:val="Hyperlink"/>
+                </w:rPr>
+                <w:t xml:space="preserve"> created through Visual Studio IDE</w:t>
+              </w:r>
+            </w:hyperlink>
+          </w:p>
+          <w:p/>
+          <w:p/>
+          <w:p/>
+        </w:tc>
+        <w:tc>
+          <w:tcPr>
+            <w:tcW w:w="1620" w:type="dxa"/>
+          </w:tcPr>
+          <w:p>
+            <w:r>
+              <w:t>Pass</w:t>
+            </w:r>
+          </w:p>
+        </w:tc>
+        <w:tc>
+          <w:tcPr>
+            <w:tcW w:w="2430" w:type="dxa"/>
+          </w:tcPr>
+          <w:p>
+            <w:hyperlink r:id="rId55" w:history="1">
+              <w:proofErr w:type="spellStart"/>
+              <w:r>
+                <w:rPr>
+                  <w:rStyle w:val="Hyperlink"/>
+                </w:rPr>
+                <w:t>VisualStudioTemplateCreationValidation</w:t>
+              </w:r>
+              <w:proofErr w:type="spellEnd"/>
+            </w:hyperlink>
+          </w:p>
+          <w:p/>
+        </w:tc>
+      </w:tr>
+      <w:tr>
+        <w:trPr>
+          <w:trHeight w:val="1814"/>
+        </w:trPr>
+        <w:tc>
+          <w:tcPr>
+            <w:tcW w:w="774" w:type="dxa"/>
+            <w:vMerge w:val="restart"/>
+          </w:tcPr>
+          <w:p>
+            <w:r>
+              <w:t>12</w:t>
+            </w:r>
+          </w:p>
+        </w:tc>
+        <w:tc>
+          <w:tcPr>
+            <w:tcW w:w="2783" w:type="dxa"/>
+            <w:vMerge w:val="restart"/>
+          </w:tcPr>
+          <w:p>
+            <w:r>
+              <w:t>Published worker validation supplemented with HAR/network capture and browser console logs. Verification confirmed no failed framework resource requests and no worker-related console errors during execution of the published application.</w:t>
+            </w:r>
+          </w:p>
+        </w:tc>
+        <w:tc>
+          <w:tcPr>
+            <w:tcW w:w="1843" w:type="dxa"/>
+          </w:tcPr>
+          <w:p>
+            <w:hyperlink r:id="rId56" w:history="1">
+              <w:r>
+                <w:rPr>
+                  <w:rStyle w:val="Hyperlink"/>
+                </w:rPr>
+                <w:t xml:space="preserve">Standalone </w:t>
+              </w:r>
+              <w:proofErr w:type="spellStart"/>
+              <w:r>
+                <w:rPr>
+                  <w:rStyle w:val="Hyperlink"/>
+                </w:rPr>
+                <w:t>WebAssembly</w:t>
+              </w:r>
+              <w:proofErr w:type="spellEnd"/>
+            </w:hyperlink>
+          </w:p>
+          <w:p/>
+        </w:tc>
+        <w:tc>
+          <w:tcPr>
+            <w:tcW w:w="1620" w:type="dxa"/>
+          </w:tcPr>
+          <w:p>
+            <w:r>
+              <w:t>Pass</w:t>
+            </w:r>
+          </w:p>
+        </w:tc>
+        <w:tc>
+          <w:tcPr>
+            <w:tcW w:w="2430" w:type="dxa"/>
+          </w:tcPr>
+          <w:p>
+            <w:hyperlink r:id="rId57" w:history="1">
+              <w:r>
+                <w:rPr>
+                  <w:rStyle w:val="Hyperlink"/>
+                </w:rPr>
+                <w:t>HAR Network Export</w:t>
+              </w:r>
+            </w:hyperlink>
+          </w:p>
+        </w:tc>
+      </w:tr>
+      <w:tr>
+        <w:trPr>
+          <w:trHeight w:val="1689"/>
+        </w:trPr>
+        <w:tc>
+          <w:tcPr>
+            <w:tcW w:w="774" w:type="dxa"/>
+            <w:vMerge/>
+          </w:tcPr>
+          <w:p/>
+        </w:tc>
+        <w:tc>
+          <w:tcPr>
+            <w:tcW w:w="2783" w:type="dxa"/>
+            <w:vMerge/>
+          </w:tcPr>
+          <w:p/>
+        </w:tc>
+        <w:tc>
+          <w:tcPr>
+            <w:tcW w:w="1843" w:type="dxa"/>
+          </w:tcPr>
+          <w:p>
             <w:hyperlink r:id="rId58" w:history="1">
               <w:proofErr w:type="spellStart"/>
               <w:r>
@@ -2178,17 +2152,9 @@
                 <w:t>InteractiveWebAssembly</w:t>
               </w:r>
               <w:proofErr w:type="spellEnd"/>
-              <w:r>
-                <w:rPr>
-                  <w:rStyle w:val="Hyperlink"/>
-                </w:rPr>
-                <w:t xml:space="preserve"> created through Visual Studio IDE</w:t>
-              </w:r>
             </w:hyperlink>
           </w:p>
           <w:p/>
-          <w:p/>
-          <w:p/>
         </w:tc>
         <w:tc>
           <w:tcPr>
@@ -2206,17 +2172,14 @@
           </w:tcPr>
           <w:p>
             <w:hyperlink r:id="rId59" w:history="1">
-              <w:proofErr w:type="spellStart"/>
-              <w:r>
-                <w:rPr>
-                  <w:rStyle w:val="Hyperlink"/>
-                </w:rPr>
-                <w:t>VisualStudioTemplateCreationValidation</w:t>
-              </w:r>
-              <w:proofErr w:type="spellEnd"/>
+              <w:r>
+                <w:rPr>
+                  <w:rStyle w:val="Hyperlink"/>
+                </w:rPr>
+                <w:t>HAR Network Export</w:t>
+              </w:r>
             </w:hyperlink>
           </w:p>
-          <w:p/>
         </w:tc>
       </w:tr>
     </w:tbl>
@@ -2333,15 +2296,7 @@
       </w:r>
       <w:proofErr w:type="spellEnd"/>
       <w:r>
-        <w:t xml:space="preserve"> should be disposed or cancelled safely. Any running worker operation should </w:t>
-      </w:r>
-      <w:proofErr w:type="gramStart"/>
-      <w:r>
-        <w:t>complete</w:t>
-      </w:r>
-      <w:proofErr w:type="gramEnd"/>
-      <w:r>
-        <w:t>, cancel, or fail gracefully without causing unhandled browser or Blazor errors. Returning to the Counter page should create a clean component instance.</w:t>
+        <w:t xml:space="preserve"> should be disposed or cancelled safely. Any running worker operation should complete, cancel, or fail gracefully without causing unhandled browser or Blazor errors. Returning to the Counter page should create a clean component instance.</w:t>
       </w:r>
     </w:p>
     <w:p>
@@ -2357,6 +2312,17 @@
           <w:bCs/>
         </w:rPr>
         <w:t>Replication Steps</w:t>
+      </w:r>
+    </w:p>
+    <w:p>
+      <w:pPr>
+        <w:numPr>
+          <w:ilvl w:val="0"/>
+          <w:numId w:val="3"/>
+        </w:numPr>
+      </w:pPr>
+      <w:r>
+        <w:t>Install .NET SDK 11.0.100-preview.7.26381.103</w:t>
       </w:r>
     </w:p>
     <w:p>
@@ -2391,7 +2357,6 @@
         </w:numPr>
       </w:pPr>
       <w:r>
-        <w:lastRenderedPageBreak/>
         <w:t xml:space="preserve">Open a terminal and navigate to the </w:t>
       </w:r>
       <w:proofErr w:type="spellStart"/>
@@ -2469,15 +2434,7 @@
         </w:numPr>
       </w:pPr>
       <w:r>
-        <w:t xml:space="preserve">Navigate to the </w:t>
-      </w:r>
-      <w:proofErr w:type="gramStart"/>
-      <w:r>
-        <w:t>publish</w:t>
-      </w:r>
-      <w:proofErr w:type="gramEnd"/>
-      <w:r>
-        <w:t xml:space="preserve"> output directory:</w:t>
+        <w:t>Navigate to the publish output directory:</w:t>
       </w:r>
     </w:p>
     <w:p>
@@ -2635,15 +2592,7 @@
         </w:numPr>
       </w:pPr>
       <w:r>
-        <w:t xml:space="preserve">Click anywhere on the page and wait for the original worker operation to </w:t>
-      </w:r>
-      <w:proofErr w:type="gramStart"/>
-      <w:r>
-        <w:t>complete</w:t>
-      </w:r>
-      <w:proofErr w:type="gramEnd"/>
-      <w:r>
-        <w:t>.</w:t>
+        <w:t>Click anywhere on the page and wait for the original worker operation to complete.</w:t>
       </w:r>
     </w:p>
     <w:p>
@@ -2714,7 +2663,7 @@
           <w:rPr>
             <w:rStyle w:val="Hyperlink"/>
           </w:rPr>
-          <w:t>https://github.com/Vinoth2562000/BlazorWebWorkerValidation/blob/main/Evidence/Evidence%2005.mp4</w:t>
+          <w:t>https://github.com/Vinoth2562000/BlazorWebWorkerValidation/blob/main/Evidence/Standalone%20WebAssembly/ClientDisposalAndNavigationValidation_Fail.mp4</w:t>
         </w:r>
       </w:hyperlink>
       <w:r>
@@ -2727,6 +2676,49 @@
           <w:b/>
           <w:bCs/>
         </w:rPr>
+        <w:t xml:space="preserve">Error Logs: </w:t>
+      </w:r>
+      <w:hyperlink r:id="rId62" w:history="1">
+        <w:r>
+          <w:rPr>
+            <w:rStyle w:val="Hyperlink"/>
+          </w:rPr>
+          <w:t>Contains error log documents</w:t>
+        </w:r>
+      </w:hyperlink>
+      <w:r>
+        <w:t>.</w:t>
+      </w:r>
+    </w:p>
+    <w:p>
+      <w:r>
+        <w:rPr>
+          <w:b/>
+          <w:bCs/>
+        </w:rPr>
+        <w:t>Published Files:</w:t>
+      </w:r>
+      <w:r>
+        <w:t xml:space="preserve"> </w:t>
+      </w:r>
+      <w:hyperlink r:id="rId63" w:history="1">
+        <w:r>
+          <w:rPr>
+            <w:rStyle w:val="Hyperlink"/>
+          </w:rPr>
+          <w:t>Contains published file documents</w:t>
+        </w:r>
+      </w:hyperlink>
+      <w:r>
+        <w:t>.</w:t>
+      </w:r>
+    </w:p>
+    <w:p>
+      <w:r>
+        <w:rPr>
+          <w:b/>
+          <w:bCs/>
+        </w:rPr>
         <w:lastRenderedPageBreak/>
         <w:t>Screenshot:</w:t>
       </w:r>
@@ -2734,6 +2726,9 @@
         <w:br/>
       </w:r>
       <w:r>
+        <w:rPr>
+          <w:noProof/>
+        </w:rPr>
         <w:drawing>
           <wp:inline distT="0" distB="0" distL="0" distR="0" wp14:anchorId="6822C894" wp14:editId="0F7886D9">
             <wp:extent cx="5655733" cy="2876207"/>
@@ -2750,7 +2745,7 @@
                     <pic:cNvPicPr/>
                   </pic:nvPicPr>
                   <pic:blipFill>
-                    <a:blip r:embed="rId62"/>
+                    <a:blip r:embed="rId64"/>
                     <a:stretch>
                       <a:fillRect/>
                     </a:stretch>
@@ -3060,7 +3055,7 @@
       <w:r>
         <w:t xml:space="preserve"> </w:t>
       </w:r>
-      <w:hyperlink r:id="rId63" w:history="1">
+      <w:hyperlink r:id="rId65" w:history="1">
         <w:r>
           <w:rPr>
             <w:rStyle w:val="Hyperlink"/>
@@ -3086,15 +3081,7 @@
     </w:p>
     <w:p>
       <w:r>
-        <w:t xml:space="preserve">If </w:t>
-      </w:r>
-      <w:proofErr w:type="gramStart"/>
-      <w:r>
-        <w:t>not</w:t>
-      </w:r>
-      <w:proofErr w:type="gramEnd"/>
-      <w:r>
-        <w:t xml:space="preserve"> already installed, install dotnet-serve:</w:t>
+        <w:t>If not already installed, install dotnet-serve:</w:t>
       </w:r>
       <w:r>
         <w:t xml:space="preserve"> </w:t>
@@ -3129,21 +3116,12 @@
           <w:bCs/>
         </w:rPr>
       </w:pPr>
-      <w:proofErr w:type="gramStart"/>
-      <w:r>
-        <w:rPr>
-          <w:b/>
-          <w:bCs/>
-        </w:rPr>
-        <w:t>Navigate to</w:t>
-      </w:r>
-      <w:proofErr w:type="gramEnd"/>
-      <w:r>
-        <w:rPr>
-          <w:b/>
-          <w:bCs/>
-        </w:rPr>
-        <w:t xml:space="preserve"> the host project:</w:t>
+      <w:r>
+        <w:rPr>
+          <w:b/>
+          <w:bCs/>
+        </w:rPr>
+        <w:t>Navigate to the host project:</w:t>
       </w:r>
     </w:p>
     <w:p>

</xml_diff>